<commit_message>
Highlight Inter-Uni Datathon finalist and eligible leaderboard result
</commit_message>
<xml_diff>
--- a/assets/Hans-Lee-Resume.docx
+++ b/assets/Hans-Lee-Resume.docx
@@ -42,7 +42,7 @@
     </w:p>
     <w:p>
       <w:r>
-        <w:t>Data professional working across AI, machine learning and enterprise analytics. Built reporting over 100+ million historical rows and performance scoring for 400+ distributors, saving more than 30 working days annually. Experienced in SQL, Python, Tableau and Power BI, with projects in recommendation systems, game-playing agents and geology prediction. ROGII Silver Medalist, Pokémon TCG Bronze Medalist and CUHK Top 15 Finalist. Completing a Master of Data Science (Research) at Monash University, expected December 2026.</w:t>
+        <w:t>Data professional working across AI, machine learning and enterprise analytics. Built reporting over 100+ million historical rows and performance scoring for 400+ distributors, saving more than 30 working days annually. Experienced in SQL, Python, Tableau and Power BI, with projects in recommendation systems, game-playing agents and geology prediction. ROGII Silver Medalist, Pokémon TCG Bronze Medalist and CUHK Top 15 Finalist and Inter-Uni Datathon finalist. Completing a Master of Data Science (Research) at Monash University, expected December 2026.</w:t>
       </w:r>
     </w:p>
     <w:p>
@@ -462,6 +462,26 @@
     </w:p>
     <w:p>
       <w:pPr>
+        <w:keepNext/>
+        <w:spacing w:after="40"/>
+      </w:pPr>
+      <w:r>
+        <w:rPr>
+          <w:b/>
+        </w:rPr>
+        <w:t>Inter-Uni Datathon 2026 | Team Lord Momo</w:t>
+      </w:r>
+    </w:p>
+    <w:p>
+      <w:pPr>
+        <w:spacing w:after="60"/>
+      </w:pPr>
+      <w:r>
+        <w:t>•  Highest-ranked eligible team on the Stream 3 Kaggle leaderboard; advanced to the presentation stage and finished as finalists. Worked on gas sensor drift classification with EDA, feature engineering and validation.</w:t>
+      </w:r>
+    </w:p>
+    <w:p>
+      <w:pPr>
         <w:pStyle w:val="Heading1"/>
       </w:pPr>
       <w:r>

</xml_diff>

<commit_message>
Link CUHK source and datathon notebook and update resume and credentials
</commit_message>
<xml_diff>
--- a/assets/Hans-Lee-Resume.docx
+++ b/assets/Hans-Lee-Resume.docx
@@ -17,7 +17,7 @@
         <w:jc w:val="center"/>
       </w:pPr>
       <w:r>
-        <w:t>Melbourne, Australia  |  stevenleehans@yahoo.com</w:t>
+        <w:t>Melbourne, Australia  |  stevenleehans@yahoo.com  |  stevenleehans.github.io</w:t>
       </w:r>
     </w:p>
     <w:p>
@@ -29,7 +29,7 @@
         <w:rPr>
           <w:sz w:val="19"/>
         </w:rPr>
-        <w:t>linkedin.com/in/hans-lee-16176885  |  github.com/stevenleehans</w:t>
+        <w:t>linkedin.com/in/hans-l-16176885  |  github.com/stevenleehans</w:t>
       </w:r>
     </w:p>
     <w:p>
@@ -42,7 +42,7 @@
     </w:p>
     <w:p>
       <w:r>
-        <w:t>Data professional working across AI, machine learning and enterprise analytics. Built reporting over 100+ million historical rows and performance scoring for 400+ distributors, saving more than 30 working days annually. Experienced in SQL, Python, Tableau and Power BI, with projects in recommendation systems, game-playing agents and geology prediction. ROGII Silver Medalist, Pokémon TCG Bronze Medalist and CUHK Top 15 Finalist and Inter-Uni Datathon finalist. Completing a Master of Data Science (Research) at Monash University, expected December 2026.</w:t>
+        <w:t>Data professional with 8+ years in business intelligence, ETL and enterprise analytics. Designed SQL Server warehouses integrating Oracle ERP and processing 10M+ rows daily across 400+ distributors and 1M+ customers. Migrated 100+ QlikView reports to Tableau and built analytics supporting marketing ROI and distribution decisions. Kaggle Silver and Bronze Medalist, CUHK-X Top 15 Finalist and Inter-Uni Datathon finalist. Completing a Monash Master of Data Science (Research), expected December 2026.</w:t>
       </w:r>
     </w:p>
     <w:p>
@@ -199,7 +199,7 @@
         <w:ind w:left="170" w:hanging="170"/>
       </w:pPr>
       <w:r>
-        <w:t>•  Built and maintained data warehouses, ETL pipelines and reporting using SQL Server, SSIS, SSMS and SSRS for sales, marketing, customer and distributor analysis.</w:t>
+        <w:t>•  Designed and built SQL Server data warehouses from scratch, integrating Oracle ERP, sales, marketing and research-app data through SSIS ETL pipelines.</w:t>
       </w:r>
     </w:p>
     <w:p>
@@ -209,7 +209,7 @@
         <w:ind w:left="170" w:hanging="170"/>
       </w:pPr>
       <w:r>
-        <w:t>•  Maintained data quality and reporting across 100+ million historical rows and approximately 10 million new rows annually.</w:t>
+        <w:t>•  Processed 10M+ rows daily across 400+ distributors and 1M+ customers, maintaining data quality and reporting over 100M+ historical rows.</w:t>
       </w:r>
     </w:p>
     <w:p>
@@ -239,7 +239,7 @@
         <w:ind w:left="170" w:hanging="170"/>
       </w:pPr>
       <w:r>
-        <w:t>•  Evaluated marketing budgets and ATL/BTL activity effectiveness; monitored sales using price, volume and mix analysis to explain performance drivers.</w:t>
+        <w:t>•  Supported marketing ROI and distribution-channel decisions by analysing TV/non-TV advertising and BTL promotions, including buy-one-get-one offers, in SQL Server and Tableau.</w:t>
       </w:r>
     </w:p>
     <w:p>
@@ -526,7 +526,7 @@
     </w:p>
     <w:p>
       <w:r>
-        <w:t>Research focus: evaluation of an AI nudging system using synthetic data and simulation.</w:t>
+        <w:t>Research: bounded technical-feasibility evaluation of adaptive messaging using synthetic data and simulation.</w:t>
       </w:r>
     </w:p>
     <w:p>
@@ -588,7 +588,7 @@
         </w:rPr>
         <w:t>Hotel Accor | Kitchen Steward</w:t>
         <w:tab/>
-        <w:t>2026 - Present</w:t>
+        <w:t>Sep 2026 - Present</w:t>
       </w:r>
     </w:p>
     <w:p>
@@ -607,7 +607,25 @@
         <w:t xml:space="preserve">Credentials: </w:t>
       </w:r>
       <w:r>
-        <w:t>Tableau Desktop Specialist; IELTS Academic 7.5</w:t>
+        <w:rPr>
+          <w:b w:val="0"/>
+        </w:rPr>
+        <w:t>Tableau Desktop Specialist (Feb 2025); Databricks Fundamental (Aug 2026); IELTS Academic 7.5 (Jan 2022)</w:t>
+      </w:r>
+    </w:p>
+    <w:p>
+      <w:r>
+        <w:rPr>
+          <w:b/>
+        </w:rPr>
+        <w:t xml:space="preserve">Planned certifications (not yet earned): </w:t>
+      </w:r>
+      <w:r>
+        <w:rPr>
+          <w:b w:val="0"/>
+          <w:i w:val="0"/>
+        </w:rPr>
+        <w:t>Microsoft PL-300; Azure cloud; further Databricks certification.</w:t>
       </w:r>
     </w:p>
     <w:p>

</xml_diff>

<commit_message>
Highlight Kaggle profile and governed self-service BI platform
</commit_message>
<xml_diff>
--- a/assets/Hans-Lee-Resume.docx
+++ b/assets/Hans-Lee-Resume.docx
@@ -42,7 +42,7 @@
     </w:p>
     <w:p>
       <w:r>
-        <w:t>Data professional with 8+ years in business intelligence, ETL and enterprise analytics. Designed SQL Server warehouses integrating Oracle ERP and processing 10M+ rows daily across 400+ distributors and 1M+ customers. Migrated 100+ QlikView reports to Tableau and built analytics supporting marketing ROI and distribution decisions. Kaggle Silver and Bronze Medalist, CUHK-X Top 15 Finalist and Inter-Uni Datathon finalist. Completing a Monash Master of Data Science (Research), expected December 2026.</w:t>
+        <w:t>Data professional with 8+ years in business intelligence, ETL and enterprise analytics. Designed SQL Server warehouses integrating Oracle ERP and processing 10M+ rows daily across 400+ distributors and 1M+ customers. Built governed self-service BI and analytics supporting marketing ROI and distribution decisions. Kaggle Competition Expert, Silver and Bronze Medalist, CUHK-X Top 15 Finalist and Inter-Uni Datathon finalist. Completing a Monash Master of Data Science (Research), expected December 2026.</w:t>
       </w:r>
     </w:p>
     <w:p>
@@ -249,7 +249,7 @@
         <w:ind w:left="170" w:hanging="170"/>
       </w:pPr>
       <w:r>
-        <w:t>•  Migrated 100+ reports from QlikView to Tableau and led Tableau environment setup, expanding access to business dashboards across divisions.</w:t>
+        <w:t>•  Built governed self-service BI through the QlikView-to-Tableau transition: security, user management, versioning and version history, data governance, master data management and schema design. Led Tableau environment setup and migrated 100+ reports.</w:t>
       </w:r>
     </w:p>
     <w:p>

</xml_diff>